<commit_message>
Restore FY1 quarterly P&L; finish workbook visuals
- The quarterly profit-and-loss table was lost in the cover redesign,
  leaving only its chart. Restored to page 2 alongside the annual
  summary. Dropped the return-on-investment table that replaced it:
  its figures already appear in the highlights and the Nasdaq path.
- Workbook: landscape CLG banner on the overview sheet in the cover's
  design language; use-of-funds donut added to the budget sheet and
  the margin and own-brand charts to the KPI sheet.
- Wording aligned across both files (总投资金额, 启动投资), sheet ⑥
  renamed, and the project row now states the 60% revenue basis.
- Audited both deliverables for stale figures and terminology; clean.

Co-Authored-By: Claude Opus 5 <noreply@anthropic.com>
Claude-Session: https://claude.ai/code/session_01UR8FHa3QiUDKMb81YgTRV3
</commit_message>
<xml_diff>
--- a/CLG-Mexico/CLG墨西哥商业计划书_2026.docx
+++ b/CLG-Mexico/CLG墨西哥商业计划书_2026.docx
@@ -1890,7 +1890,7 @@
           <w:color w:val="0B2545"/>
           <w:sz w:val="17"/>
         </w:rPr>
-        <w:t>投 资 回 报 测 算   RETURN ON INVESTMENT</w:t>
+        <w:t>首 年 分 季 度 损 益   FY1 QUARTERLY P&amp;L</w:t>
       </w:r>
     </w:p>
     <w:tbl>
@@ -1909,10 +1909,12 @@
         <w:tblLook w:firstColumn="1" w:firstRow="1" w:lastColumn="0" w:lastRow="0" w:noHBand="0" w:noVBand="1" w:val="04A0"/>
       </w:tblPr>
       <w:tblGrid>
-        <w:gridCol w:w="2211"/>
         <w:gridCol w:w="2608"/>
-        <w:gridCol w:w="1984"/>
-        <w:gridCol w:w="3288"/>
+        <w:gridCol w:w="1417"/>
+        <w:gridCol w:w="1417"/>
+        <w:gridCol w:w="1417"/>
+        <w:gridCol w:w="1417"/>
+        <w:gridCol w:w="1814"/>
       </w:tblGrid>
       <w:tr>
         <w:trPr>
@@ -1920,7 +1922,7 @@
         </w:trPr>
         <w:tc>
           <w:tcPr>
-            <w:tcW w:type="dxa" w:w="2211"/>
+            <w:tcW w:type="dxa" w:w="2608"/>
             <w:shd w:val="clear" w:color="auto" w:fill="0B2545"/>
             <w:tcMar>
               <w:top w:w="40" w:type="dxa"/>
@@ -1945,13 +1947,13 @@
                 <w:color w:val="FFFFFF"/>
                 <w:sz w:val="16"/>
               </w:rPr>
-              <w:t>回报口径</w:t>
-            </w:r>
-          </w:p>
-        </w:tc>
-        <w:tc>
-          <w:tcPr>
-            <w:tcW w:type="dxa" w:w="2608"/>
+              <w:t>项目（百万比索）</w:t>
+            </w:r>
+          </w:p>
+        </w:tc>
+        <w:tc>
+          <w:tcPr>
+            <w:tcW w:type="dxa" w:w="1417"/>
             <w:shd w:val="clear" w:color="auto" w:fill="0B2545"/>
             <w:tcMar>
               <w:top w:w="40" w:type="dxa"/>
@@ -1976,13 +1978,13 @@
                 <w:color w:val="FFFFFF"/>
                 <w:sz w:val="16"/>
               </w:rPr>
-              <w:t>金额</w:t>
-            </w:r>
-          </w:p>
-        </w:tc>
-        <w:tc>
-          <w:tcPr>
-            <w:tcW w:type="dxa" w:w="1984"/>
+              <w:t>第一季度</w:t>
+            </w:r>
+          </w:p>
+        </w:tc>
+        <w:tc>
+          <w:tcPr>
+            <w:tcW w:type="dxa" w:w="1417"/>
             <w:shd w:val="clear" w:color="auto" w:fill="0B2545"/>
             <w:tcMar>
               <w:top w:w="40" w:type="dxa"/>
@@ -2007,13 +2009,13 @@
                 <w:color w:val="FFFFFF"/>
                 <w:sz w:val="16"/>
               </w:rPr>
-              <w:t>相对总投资额（115 万美元）</w:t>
-            </w:r>
-          </w:p>
-        </w:tc>
-        <w:tc>
-          <w:tcPr>
-            <w:tcW w:type="dxa" w:w="3288"/>
+              <w:t>第二季度</w:t>
+            </w:r>
+          </w:p>
+        </w:tc>
+        <w:tc>
+          <w:tcPr>
+            <w:tcW w:type="dxa" w:w="1417"/>
             <w:shd w:val="clear" w:color="auto" w:fill="0B2545"/>
             <w:tcMar>
               <w:top w:w="40" w:type="dxa"/>
@@ -2038,7 +2040,69 @@
                 <w:color w:val="FFFFFF"/>
                 <w:sz w:val="16"/>
               </w:rPr>
-              <w:t>说明</w:t>
+              <w:t>第三季度</w:t>
+            </w:r>
+          </w:p>
+        </w:tc>
+        <w:tc>
+          <w:tcPr>
+            <w:tcW w:type="dxa" w:w="1417"/>
+            <w:shd w:val="clear" w:color="auto" w:fill="0B2545"/>
+            <w:tcMar>
+              <w:top w:w="40" w:type="dxa"/>
+              <w:left w:w="90" w:type="dxa"/>
+              <w:bottom w:w="40" w:type="dxa"/>
+              <w:right w:w="90" w:type="dxa"/>
+            </w:tcMar>
+            <w:vAlign w:val="center"/>
+          </w:tcPr>
+          <w:p>
+            <w:pPr>
+              <w:keepNext/>
+              <w:spacing w:before="30" w:after="30" w:lineRule="auto" w:line="264"/>
+              <w:jc w:val="center"/>
+            </w:pPr>
+            <w:r/>
+            <w:r>
+              <w:rPr>
+                <w:rFonts w:ascii="Calibri" w:hAnsi="Calibri" w:eastAsia="Microsoft YaHei"/>
+                <w:b/>
+                <w:i w:val="0"/>
+                <w:color w:val="FFFFFF"/>
+                <w:sz w:val="16"/>
+              </w:rPr>
+              <w:t>第四季度</w:t>
+            </w:r>
+          </w:p>
+        </w:tc>
+        <w:tc>
+          <w:tcPr>
+            <w:tcW w:type="dxa" w:w="1814"/>
+            <w:shd w:val="clear" w:color="auto" w:fill="0B2545"/>
+            <w:tcMar>
+              <w:top w:w="40" w:type="dxa"/>
+              <w:left w:w="90" w:type="dxa"/>
+              <w:bottom w:w="40" w:type="dxa"/>
+              <w:right w:w="90" w:type="dxa"/>
+            </w:tcMar>
+            <w:vAlign w:val="center"/>
+          </w:tcPr>
+          <w:p>
+            <w:pPr>
+              <w:keepNext/>
+              <w:spacing w:before="30" w:after="30" w:lineRule="auto" w:line="264"/>
+              <w:jc w:val="center"/>
+            </w:pPr>
+            <w:r/>
+            <w:r>
+              <w:rPr>
+                <w:rFonts w:ascii="Calibri" w:hAnsi="Calibri" w:eastAsia="Microsoft YaHei"/>
+                <w:b/>
+                <w:i w:val="0"/>
+                <w:color w:val="FFFFFF"/>
+                <w:sz w:val="16"/>
+              </w:rPr>
+              <w:t>第一年合计</w:t>
             </w:r>
           </w:p>
         </w:tc>
@@ -2046,7 +2110,7 @@
       <w:tr>
         <w:tc>
           <w:tcPr>
-            <w:tcW w:type="dxa" w:w="2211"/>
+            <w:tcW w:type="dxa" w:w="2608"/>
             <w:tcMar>
               <w:top w:w="40" w:type="dxa"/>
               <w:left w:w="90" w:type="dxa"/>
@@ -2058,7 +2122,7 @@
           <w:p>
             <w:pPr>
               <w:keepNext/>
-              <w:spacing w:before="14" w:after="14" w:lineRule="auto" w:line="264"/>
+              <w:spacing w:before="11" w:after="11" w:lineRule="auto" w:line="264"/>
             </w:pPr>
             <w:r/>
             <w:r>
@@ -2067,15 +2131,15 @@
                 <w:b w:val="0"/>
                 <w:i w:val="0"/>
                 <w:color w:val="1A1A1A"/>
-                <w:sz w:val="15"/>
-              </w:rPr>
-              <w:t>第三年 EBITDA</w:t>
-            </w:r>
-          </w:p>
-        </w:tc>
-        <w:tc>
-          <w:tcPr>
-            <w:tcW w:type="dxa" w:w="2608"/>
+                <w:sz w:val="14"/>
+              </w:rPr>
+              <w:t>营业收入</w:t>
+            </w:r>
+          </w:p>
+        </w:tc>
+        <w:tc>
+          <w:tcPr>
+            <w:tcW w:type="dxa" w:w="1417"/>
             <w:tcMar>
               <w:top w:w="40" w:type="dxa"/>
               <w:left w:w="90" w:type="dxa"/>
@@ -2087,7 +2151,7 @@
           <w:p>
             <w:pPr>
               <w:keepNext/>
-              <w:spacing w:before="14" w:after="14" w:lineRule="auto" w:line="264"/>
+              <w:spacing w:before="11" w:after="11" w:lineRule="auto" w:line="264"/>
               <w:jc w:val="center"/>
             </w:pPr>
             <w:r/>
@@ -2097,15 +2161,15 @@
                 <w:b w:val="0"/>
                 <w:i w:val="0"/>
                 <w:color w:val="1A1A1A"/>
-                <w:sz w:val="15"/>
-              </w:rPr>
-              <w:t>9,690 万比索 / 524 万美元</w:t>
-            </w:r>
-          </w:p>
-        </w:tc>
-        <w:tc>
-          <w:tcPr>
-            <w:tcW w:type="dxa" w:w="1984"/>
+                <w:sz w:val="14"/>
+              </w:rPr>
+              <w:t>12.00</w:t>
+            </w:r>
+          </w:p>
+        </w:tc>
+        <w:tc>
+          <w:tcPr>
+            <w:tcW w:type="dxa" w:w="1417"/>
             <w:tcMar>
               <w:top w:w="40" w:type="dxa"/>
               <w:left w:w="90" w:type="dxa"/>
@@ -2117,7 +2181,7 @@
           <w:p>
             <w:pPr>
               <w:keepNext/>
-              <w:spacing w:before="14" w:after="14" w:lineRule="auto" w:line="264"/>
+              <w:spacing w:before="11" w:after="11" w:lineRule="auto" w:line="264"/>
               <w:jc w:val="center"/>
             </w:pPr>
             <w:r/>
@@ -2127,15 +2191,15 @@
                 <w:b w:val="0"/>
                 <w:i w:val="0"/>
                 <w:color w:val="1A1A1A"/>
-                <w:sz w:val="15"/>
-              </w:rPr>
-              <w:t>4.6 倍</w:t>
-            </w:r>
-          </w:p>
-        </w:tc>
-        <w:tc>
-          <w:tcPr>
-            <w:tcW w:type="dxa" w:w="3288"/>
+                <w:sz w:val="14"/>
+              </w:rPr>
+              <w:t>21.00</w:t>
+            </w:r>
+          </w:p>
+        </w:tc>
+        <w:tc>
+          <w:tcPr>
+            <w:tcW w:type="dxa" w:w="1417"/>
             <w:tcMar>
               <w:top w:w="40" w:type="dxa"/>
               <w:left w:w="90" w:type="dxa"/>
@@ -2147,7 +2211,8 @@
           <w:p>
             <w:pPr>
               <w:keepNext/>
-              <w:spacing w:before="14" w:after="14" w:lineRule="auto" w:line="264"/>
+              <w:spacing w:before="11" w:after="11" w:lineRule="auto" w:line="264"/>
+              <w:jc w:val="center"/>
             </w:pPr>
             <w:r/>
             <w:r>
@@ -2156,9 +2221,69 @@
                 <w:b w:val="0"/>
                 <w:i w:val="0"/>
                 <w:color w:val="1A1A1A"/>
-                <w:sz w:val="15"/>
-              </w:rPr>
-              <w:t>单一年度即覆盖总投资 4.6 倍</w:t>
+                <w:sz w:val="14"/>
+              </w:rPr>
+              <w:t>28.00</w:t>
+            </w:r>
+          </w:p>
+        </w:tc>
+        <w:tc>
+          <w:tcPr>
+            <w:tcW w:type="dxa" w:w="1417"/>
+            <w:tcMar>
+              <w:top w:w="40" w:type="dxa"/>
+              <w:left w:w="90" w:type="dxa"/>
+              <w:bottom w:w="40" w:type="dxa"/>
+              <w:right w:w="90" w:type="dxa"/>
+            </w:tcMar>
+            <w:vAlign w:val="center"/>
+          </w:tcPr>
+          <w:p>
+            <w:pPr>
+              <w:keepNext/>
+              <w:spacing w:before="11" w:after="11" w:lineRule="auto" w:line="264"/>
+              <w:jc w:val="center"/>
+            </w:pPr>
+            <w:r/>
+            <w:r>
+              <w:rPr>
+                <w:rFonts w:ascii="Calibri" w:hAnsi="Calibri" w:eastAsia="Microsoft YaHei"/>
+                <w:b w:val="0"/>
+                <w:i w:val="0"/>
+                <w:color w:val="1A1A1A"/>
+                <w:sz w:val="14"/>
+              </w:rPr>
+              <w:t>38.00</w:t>
+            </w:r>
+          </w:p>
+        </w:tc>
+        <w:tc>
+          <w:tcPr>
+            <w:tcW w:type="dxa" w:w="1814"/>
+            <w:tcMar>
+              <w:top w:w="40" w:type="dxa"/>
+              <w:left w:w="90" w:type="dxa"/>
+              <w:bottom w:w="40" w:type="dxa"/>
+              <w:right w:w="90" w:type="dxa"/>
+            </w:tcMar>
+            <w:vAlign w:val="center"/>
+          </w:tcPr>
+          <w:p>
+            <w:pPr>
+              <w:keepNext/>
+              <w:spacing w:before="11" w:after="11" w:lineRule="auto" w:line="264"/>
+              <w:jc w:val="center"/>
+            </w:pPr>
+            <w:r/>
+            <w:r>
+              <w:rPr>
+                <w:rFonts w:ascii="Calibri" w:hAnsi="Calibri" w:eastAsia="Microsoft YaHei"/>
+                <w:b w:val="0"/>
+                <w:i w:val="0"/>
+                <w:color w:val="1A1A1A"/>
+                <w:sz w:val="14"/>
+              </w:rPr>
+              <w:t>99.00</w:t>
             </w:r>
           </w:p>
         </w:tc>
@@ -2166,36 +2291,6 @@
       <w:tr>
         <w:tc>
           <w:tcPr>
-            <w:tcW w:type="dxa" w:w="2211"/>
-            <w:shd w:val="clear" w:color="auto" w:fill="F2F4F7"/>
-            <w:tcMar>
-              <w:top w:w="40" w:type="dxa"/>
-              <w:left w:w="90" w:type="dxa"/>
-              <w:bottom w:w="40" w:type="dxa"/>
-              <w:right w:w="90" w:type="dxa"/>
-            </w:tcMar>
-            <w:vAlign w:val="center"/>
-          </w:tcPr>
-          <w:p>
-            <w:pPr>
-              <w:keepNext/>
-              <w:spacing w:before="14" w:after="14" w:lineRule="auto" w:line="264"/>
-            </w:pPr>
-            <w:r/>
-            <w:r>
-              <w:rPr>
-                <w:rFonts w:ascii="Calibri" w:hAnsi="Calibri" w:eastAsia="Microsoft YaHei"/>
-                <w:b w:val="0"/>
-                <w:i w:val="0"/>
-                <w:color w:val="1A1A1A"/>
-                <w:sz w:val="15"/>
-              </w:rPr>
-              <w:t>三年累计 EBITDA</w:t>
-            </w:r>
-          </w:p>
-        </w:tc>
-        <w:tc>
-          <w:tcPr>
             <w:tcW w:type="dxa" w:w="2608"/>
             <w:shd w:val="clear" w:color="auto" w:fill="F2F4F7"/>
             <w:tcMar>
@@ -2209,7 +2304,37 @@
           <w:p>
             <w:pPr>
               <w:keepNext/>
-              <w:spacing w:before="14" w:after="14" w:lineRule="auto" w:line="264"/>
+              <w:spacing w:before="11" w:after="11" w:lineRule="auto" w:line="264"/>
+            </w:pPr>
+            <w:r/>
+            <w:r>
+              <w:rPr>
+                <w:rFonts w:ascii="Calibri" w:hAnsi="Calibri" w:eastAsia="Microsoft YaHei"/>
+                <w:b w:val="0"/>
+                <w:i w:val="0"/>
+                <w:color w:val="1A1A1A"/>
+                <w:sz w:val="14"/>
+              </w:rPr>
+              <w:t>毛利润（毛利率 47%）</w:t>
+            </w:r>
+          </w:p>
+        </w:tc>
+        <w:tc>
+          <w:tcPr>
+            <w:tcW w:type="dxa" w:w="1417"/>
+            <w:shd w:val="clear" w:color="auto" w:fill="F2F4F7"/>
+            <w:tcMar>
+              <w:top w:w="40" w:type="dxa"/>
+              <w:left w:w="90" w:type="dxa"/>
+              <w:bottom w:w="40" w:type="dxa"/>
+              <w:right w:w="90" w:type="dxa"/>
+            </w:tcMar>
+            <w:vAlign w:val="center"/>
+          </w:tcPr>
+          <w:p>
+            <w:pPr>
+              <w:keepNext/>
+              <w:spacing w:before="11" w:after="11" w:lineRule="auto" w:line="264"/>
               <w:jc w:val="center"/>
             </w:pPr>
             <w:r/>
@@ -2219,15 +2344,15 @@
                 <w:b w:val="0"/>
                 <w:i w:val="0"/>
                 <w:color w:val="1A1A1A"/>
-                <w:sz w:val="15"/>
-              </w:rPr>
-              <w:t>1.566 亿比索 / 847 万美元</w:t>
-            </w:r>
-          </w:p>
-        </w:tc>
-        <w:tc>
-          <w:tcPr>
-            <w:tcW w:type="dxa" w:w="1984"/>
+                <w:sz w:val="14"/>
+              </w:rPr>
+              <w:t>5.64</w:t>
+            </w:r>
+          </w:p>
+        </w:tc>
+        <w:tc>
+          <w:tcPr>
+            <w:tcW w:type="dxa" w:w="1417"/>
             <w:shd w:val="clear" w:color="auto" w:fill="F2F4F7"/>
             <w:tcMar>
               <w:top w:w="40" w:type="dxa"/>
@@ -2240,7 +2365,7 @@
           <w:p>
             <w:pPr>
               <w:keepNext/>
-              <w:spacing w:before="14" w:after="14" w:lineRule="auto" w:line="264"/>
+              <w:spacing w:before="11" w:after="11" w:lineRule="auto" w:line="264"/>
               <w:jc w:val="center"/>
             </w:pPr>
             <w:r/>
@@ -2250,15 +2375,15 @@
                 <w:b w:val="0"/>
                 <w:i w:val="0"/>
                 <w:color w:val="1A1A1A"/>
-                <w:sz w:val="15"/>
-              </w:rPr>
-              <w:t>7.4 倍</w:t>
-            </w:r>
-          </w:p>
-        </w:tc>
-        <w:tc>
-          <w:tcPr>
-            <w:tcW w:type="dxa" w:w="3288"/>
+                <w:sz w:val="14"/>
+              </w:rPr>
+              <w:t>9.87</w:t>
+            </w:r>
+          </w:p>
+        </w:tc>
+        <w:tc>
+          <w:tcPr>
+            <w:tcW w:type="dxa" w:w="1417"/>
             <w:shd w:val="clear" w:color="auto" w:fill="F2F4F7"/>
             <w:tcMar>
               <w:top w:w="40" w:type="dxa"/>
@@ -2271,7 +2396,8 @@
           <w:p>
             <w:pPr>
               <w:keepNext/>
-              <w:spacing w:before="14" w:after="14" w:lineRule="auto" w:line="264"/>
+              <w:spacing w:before="11" w:after="11" w:lineRule="auto" w:line="264"/>
+              <w:jc w:val="center"/>
             </w:pPr>
             <w:r/>
             <w:r>
@@ -2280,9 +2406,71 @@
                 <w:b w:val="0"/>
                 <w:i w:val="0"/>
                 <w:color w:val="1A1A1A"/>
-                <w:sz w:val="15"/>
-              </w:rPr>
-              <w:t>三年内不追加任何股权融资</w:t>
+                <w:sz w:val="14"/>
+              </w:rPr>
+              <w:t>13.16</w:t>
+            </w:r>
+          </w:p>
+        </w:tc>
+        <w:tc>
+          <w:tcPr>
+            <w:tcW w:type="dxa" w:w="1417"/>
+            <w:shd w:val="clear" w:color="auto" w:fill="F2F4F7"/>
+            <w:tcMar>
+              <w:top w:w="40" w:type="dxa"/>
+              <w:left w:w="90" w:type="dxa"/>
+              <w:bottom w:w="40" w:type="dxa"/>
+              <w:right w:w="90" w:type="dxa"/>
+            </w:tcMar>
+            <w:vAlign w:val="center"/>
+          </w:tcPr>
+          <w:p>
+            <w:pPr>
+              <w:keepNext/>
+              <w:spacing w:before="11" w:after="11" w:lineRule="auto" w:line="264"/>
+              <w:jc w:val="center"/>
+            </w:pPr>
+            <w:r/>
+            <w:r>
+              <w:rPr>
+                <w:rFonts w:ascii="Calibri" w:hAnsi="Calibri" w:eastAsia="Microsoft YaHei"/>
+                <w:b w:val="0"/>
+                <w:i w:val="0"/>
+                <w:color w:val="1A1A1A"/>
+                <w:sz w:val="14"/>
+              </w:rPr>
+              <w:t>17.86</w:t>
+            </w:r>
+          </w:p>
+        </w:tc>
+        <w:tc>
+          <w:tcPr>
+            <w:tcW w:type="dxa" w:w="1814"/>
+            <w:shd w:val="clear" w:color="auto" w:fill="F2F4F7"/>
+            <w:tcMar>
+              <w:top w:w="40" w:type="dxa"/>
+              <w:left w:w="90" w:type="dxa"/>
+              <w:bottom w:w="40" w:type="dxa"/>
+              <w:right w:w="90" w:type="dxa"/>
+            </w:tcMar>
+            <w:vAlign w:val="center"/>
+          </w:tcPr>
+          <w:p>
+            <w:pPr>
+              <w:keepNext/>
+              <w:spacing w:before="11" w:after="11" w:lineRule="auto" w:line="264"/>
+              <w:jc w:val="center"/>
+            </w:pPr>
+            <w:r/>
+            <w:r>
+              <w:rPr>
+                <w:rFonts w:ascii="Calibri" w:hAnsi="Calibri" w:eastAsia="Microsoft YaHei"/>
+                <w:b w:val="0"/>
+                <w:i w:val="0"/>
+                <w:color w:val="1A1A1A"/>
+                <w:sz w:val="14"/>
+              </w:rPr>
+              <w:t>46.53</w:t>
             </w:r>
           </w:p>
         </w:tc>
@@ -2290,7 +2478,7 @@
       <w:tr>
         <w:tc>
           <w:tcPr>
-            <w:tcW w:type="dxa" w:w="2211"/>
+            <w:tcW w:type="dxa" w:w="2608"/>
             <w:tcMar>
               <w:top w:w="40" w:type="dxa"/>
               <w:left w:w="90" w:type="dxa"/>
@@ -2302,7 +2490,7 @@
           <w:p>
             <w:pPr>
               <w:keepNext/>
-              <w:spacing w:before="14" w:after="14" w:lineRule="auto" w:line="264"/>
+              <w:spacing w:before="11" w:after="11" w:lineRule="auto" w:line="264"/>
             </w:pPr>
             <w:r/>
             <w:r>
@@ -2311,15 +2499,15 @@
                 <w:b w:val="0"/>
                 <w:i w:val="0"/>
                 <w:color w:val="1A1A1A"/>
-                <w:sz w:val="15"/>
-              </w:rPr>
-              <w:t>三年累计净利润</w:t>
-            </w:r>
-          </w:p>
-        </w:tc>
-        <w:tc>
-          <w:tcPr>
-            <w:tcW w:type="dxa" w:w="2608"/>
+                <w:sz w:val="14"/>
+              </w:rPr>
+              <w:t>营业费用</w:t>
+            </w:r>
+          </w:p>
+        </w:tc>
+        <w:tc>
+          <w:tcPr>
+            <w:tcW w:type="dxa" w:w="1417"/>
             <w:tcMar>
               <w:top w:w="40" w:type="dxa"/>
               <w:left w:w="90" w:type="dxa"/>
@@ -2331,7 +2519,7 @@
           <w:p>
             <w:pPr>
               <w:keepNext/>
-              <w:spacing w:before="14" w:after="14" w:lineRule="auto" w:line="264"/>
+              <w:spacing w:before="11" w:after="11" w:lineRule="auto" w:line="264"/>
               <w:jc w:val="center"/>
             </w:pPr>
             <w:r/>
@@ -2341,15 +2529,15 @@
                 <w:b w:val="0"/>
                 <w:i w:val="0"/>
                 <w:color w:val="1A1A1A"/>
-                <w:sz w:val="15"/>
-              </w:rPr>
-              <w:t>1.047 亿比索 / 566 万美元</w:t>
-            </w:r>
-          </w:p>
-        </w:tc>
-        <w:tc>
-          <w:tcPr>
-            <w:tcW w:type="dxa" w:w="1984"/>
+                <w:sz w:val="14"/>
+              </w:rPr>
+              <w:t>6.40</w:t>
+            </w:r>
+          </w:p>
+        </w:tc>
+        <w:tc>
+          <w:tcPr>
+            <w:tcW w:type="dxa" w:w="1417"/>
             <w:tcMar>
               <w:top w:w="40" w:type="dxa"/>
               <w:left w:w="90" w:type="dxa"/>
@@ -2361,7 +2549,7 @@
           <w:p>
             <w:pPr>
               <w:keepNext/>
-              <w:spacing w:before="14" w:after="14" w:lineRule="auto" w:line="264"/>
+              <w:spacing w:before="11" w:after="11" w:lineRule="auto" w:line="264"/>
               <w:jc w:val="center"/>
             </w:pPr>
             <w:r/>
@@ -2371,15 +2559,15 @@
                 <w:b w:val="0"/>
                 <w:i w:val="0"/>
                 <w:color w:val="1A1A1A"/>
-                <w:sz w:val="15"/>
-              </w:rPr>
-              <w:t>4.9 倍</w:t>
-            </w:r>
-          </w:p>
-        </w:tc>
-        <w:tc>
-          <w:tcPr>
-            <w:tcW w:type="dxa" w:w="3288"/>
+                <w:sz w:val="14"/>
+              </w:rPr>
+              <w:t>7.30</w:t>
+            </w:r>
+          </w:p>
+        </w:tc>
+        <w:tc>
+          <w:tcPr>
+            <w:tcW w:type="dxa" w:w="1417"/>
             <w:tcMar>
               <w:top w:w="40" w:type="dxa"/>
               <w:left w:w="90" w:type="dxa"/>
@@ -2391,7 +2579,8 @@
           <w:p>
             <w:pPr>
               <w:keepNext/>
-              <w:spacing w:before="14" w:after="14" w:lineRule="auto" w:line="264"/>
+              <w:spacing w:before="11" w:after="11" w:lineRule="auto" w:line="264"/>
+              <w:jc w:val="center"/>
             </w:pPr>
             <w:r/>
             <w:r>
@@ -2400,9 +2589,69 @@
                 <w:b w:val="0"/>
                 <w:i w:val="0"/>
                 <w:color w:val="1A1A1A"/>
-                <w:sz w:val="15"/>
-              </w:rPr>
-              <w:t>现金回收周期 24 个月以内</w:t>
+                <w:sz w:val="14"/>
+              </w:rPr>
+              <w:t>8.00</w:t>
+            </w:r>
+          </w:p>
+        </w:tc>
+        <w:tc>
+          <w:tcPr>
+            <w:tcW w:type="dxa" w:w="1417"/>
+            <w:tcMar>
+              <w:top w:w="40" w:type="dxa"/>
+              <w:left w:w="90" w:type="dxa"/>
+              <w:bottom w:w="40" w:type="dxa"/>
+              <w:right w:w="90" w:type="dxa"/>
+            </w:tcMar>
+            <w:vAlign w:val="center"/>
+          </w:tcPr>
+          <w:p>
+            <w:pPr>
+              <w:keepNext/>
+              <w:spacing w:before="11" w:after="11" w:lineRule="auto" w:line="264"/>
+              <w:jc w:val="center"/>
+            </w:pPr>
+            <w:r/>
+            <w:r>
+              <w:rPr>
+                <w:rFonts w:ascii="Calibri" w:hAnsi="Calibri" w:eastAsia="Microsoft YaHei"/>
+                <w:b w:val="0"/>
+                <w:i w:val="0"/>
+                <w:color w:val="1A1A1A"/>
+                <w:sz w:val="14"/>
+              </w:rPr>
+              <w:t>8.95</w:t>
+            </w:r>
+          </w:p>
+        </w:tc>
+        <w:tc>
+          <w:tcPr>
+            <w:tcW w:type="dxa" w:w="1814"/>
+            <w:tcMar>
+              <w:top w:w="40" w:type="dxa"/>
+              <w:left w:w="90" w:type="dxa"/>
+              <w:bottom w:w="40" w:type="dxa"/>
+              <w:right w:w="90" w:type="dxa"/>
+            </w:tcMar>
+            <w:vAlign w:val="center"/>
+          </w:tcPr>
+          <w:p>
+            <w:pPr>
+              <w:keepNext/>
+              <w:spacing w:before="11" w:after="11" w:lineRule="auto" w:line="264"/>
+              <w:jc w:val="center"/>
+            </w:pPr>
+            <w:r/>
+            <w:r>
+              <w:rPr>
+                <w:rFonts w:ascii="Calibri" w:hAnsi="Calibri" w:eastAsia="Microsoft YaHei"/>
+                <w:b w:val="0"/>
+                <w:i w:val="0"/>
+                <w:color w:val="1A1A1A"/>
+                <w:sz w:val="14"/>
+              </w:rPr>
+              <w:t>30.65</w:t>
             </w:r>
           </w:p>
         </w:tc>
@@ -2410,35 +2659,6 @@
       <w:tr>
         <w:tc>
           <w:tcPr>
-            <w:tcW w:type="dxa" w:w="2211"/>
-            <w:shd w:val="clear" w:color="auto" w:fill="F2F4F7"/>
-            <w:tcMar>
-              <w:top w:w="40" w:type="dxa"/>
-              <w:left w:w="90" w:type="dxa"/>
-              <w:bottom w:w="40" w:type="dxa"/>
-              <w:right w:w="90" w:type="dxa"/>
-            </w:tcMar>
-            <w:vAlign w:val="center"/>
-          </w:tcPr>
-          <w:p>
-            <w:pPr>
-              <w:spacing w:before="14" w:after="14" w:lineRule="auto" w:line="264"/>
-            </w:pPr>
-            <w:r/>
-            <w:r>
-              <w:rPr>
-                <w:rFonts w:ascii="Calibri" w:hAnsi="Calibri" w:eastAsia="Microsoft YaHei"/>
-                <w:b w:val="0"/>
-                <w:i w:val="0"/>
-                <w:color w:val="1A1A1A"/>
-                <w:sz w:val="15"/>
-              </w:rPr>
-              <w:t>第五年纳斯达克上市估值</w:t>
-            </w:r>
-          </w:p>
-        </w:tc>
-        <w:tc>
-          <w:tcPr>
             <w:tcW w:type="dxa" w:w="2608"/>
             <w:shd w:val="clear" w:color="auto" w:fill="F2F4F7"/>
             <w:tcMar>
@@ -2451,7 +2671,38 @@
           </w:tcPr>
           <w:p>
             <w:pPr>
-              <w:spacing w:before="14" w:after="14" w:lineRule="auto" w:line="264"/>
+              <w:keepNext/>
+              <w:spacing w:before="11" w:after="11" w:lineRule="auto" w:line="264"/>
+            </w:pPr>
+            <w:r/>
+            <w:r>
+              <w:rPr>
+                <w:rFonts w:ascii="Calibri" w:hAnsi="Calibri" w:eastAsia="Microsoft YaHei"/>
+                <w:b w:val="0"/>
+                <w:i w:val="0"/>
+                <w:color w:val="1A1A1A"/>
+                <w:sz w:val="14"/>
+              </w:rPr>
+              <w:t>EBITDA（EBITDA 率）</w:t>
+            </w:r>
+          </w:p>
+        </w:tc>
+        <w:tc>
+          <w:tcPr>
+            <w:tcW w:type="dxa" w:w="1417"/>
+            <w:shd w:val="clear" w:color="auto" w:fill="F2F4F7"/>
+            <w:tcMar>
+              <w:top w:w="40" w:type="dxa"/>
+              <w:left w:w="90" w:type="dxa"/>
+              <w:bottom w:w="40" w:type="dxa"/>
+              <w:right w:w="90" w:type="dxa"/>
+            </w:tcMar>
+            <w:vAlign w:val="center"/>
+          </w:tcPr>
+          <w:p>
+            <w:pPr>
+              <w:keepNext/>
+              <w:spacing w:before="11" w:after="11" w:lineRule="auto" w:line="264"/>
               <w:jc w:val="center"/>
             </w:pPr>
             <w:r/>
@@ -2461,15 +2712,15 @@
                 <w:b w:val="0"/>
                 <w:i w:val="0"/>
                 <w:color w:val="1A1A1A"/>
-                <w:sz w:val="15"/>
-              </w:rPr>
-              <w:t>1.5–2.4 亿美元</w:t>
-            </w:r>
-          </w:p>
-        </w:tc>
-        <w:tc>
-          <w:tcPr>
-            <w:tcW w:type="dxa" w:w="1984"/>
+                <w:sz w:val="14"/>
+              </w:rPr>
+              <w:t>(0.76)</w:t>
+            </w:r>
+          </w:p>
+        </w:tc>
+        <w:tc>
+          <w:tcPr>
+            <w:tcW w:type="dxa" w:w="1417"/>
             <w:shd w:val="clear" w:color="auto" w:fill="F2F4F7"/>
             <w:tcMar>
               <w:top w:w="40" w:type="dxa"/>
@@ -2481,7 +2732,8 @@
           </w:tcPr>
           <w:p>
             <w:pPr>
-              <w:spacing w:before="14" w:after="14" w:lineRule="auto" w:line="264"/>
+              <w:keepNext/>
+              <w:spacing w:before="11" w:after="11" w:lineRule="auto" w:line="264"/>
               <w:jc w:val="center"/>
             </w:pPr>
             <w:r/>
@@ -2491,15 +2743,15 @@
                 <w:b w:val="0"/>
                 <w:i w:val="0"/>
                 <w:color w:val="1A1A1A"/>
-                <w:sz w:val="15"/>
-              </w:rPr>
-              <w:t>130–210 倍</w:t>
-            </w:r>
-          </w:p>
-        </w:tc>
-        <w:tc>
-          <w:tcPr>
-            <w:tcW w:type="dxa" w:w="3288"/>
+                <w:sz w:val="14"/>
+              </w:rPr>
+              <w:t>2.57（12.2%）</w:t>
+            </w:r>
+          </w:p>
+        </w:tc>
+        <w:tc>
+          <w:tcPr>
+            <w:tcW w:type="dxa" w:w="1417"/>
             <w:shd w:val="clear" w:color="auto" w:fill="F2F4F7"/>
             <w:tcMar>
               <w:top w:w="40" w:type="dxa"/>
@@ -2511,7 +2763,9 @@
           </w:tcPr>
           <w:p>
             <w:pPr>
-              <w:spacing w:before="14" w:after="14" w:lineRule="auto" w:line="264"/>
+              <w:keepNext/>
+              <w:spacing w:before="11" w:after="11" w:lineRule="auto" w:line="264"/>
+              <w:jc w:val="center"/>
             </w:pPr>
             <w:r/>
             <w:r>
@@ -2520,14 +2774,452 @@
                 <w:b w:val="0"/>
                 <w:i w:val="0"/>
                 <w:color w:val="1A1A1A"/>
-                <w:sz w:val="15"/>
-              </w:rPr>
-              <w:t>1.8 倍 EV/Revenue 或 22 倍 P/E</w:t>
+                <w:sz w:val="14"/>
+              </w:rPr>
+              <w:t>5.16（18.4%）</w:t>
+            </w:r>
+          </w:p>
+        </w:tc>
+        <w:tc>
+          <w:tcPr>
+            <w:tcW w:type="dxa" w:w="1417"/>
+            <w:shd w:val="clear" w:color="auto" w:fill="F2F4F7"/>
+            <w:tcMar>
+              <w:top w:w="40" w:type="dxa"/>
+              <w:left w:w="90" w:type="dxa"/>
+              <w:bottom w:w="40" w:type="dxa"/>
+              <w:right w:w="90" w:type="dxa"/>
+            </w:tcMar>
+            <w:vAlign w:val="center"/>
+          </w:tcPr>
+          <w:p>
+            <w:pPr>
+              <w:keepNext/>
+              <w:spacing w:before="11" w:after="11" w:lineRule="auto" w:line="264"/>
+              <w:jc w:val="center"/>
+            </w:pPr>
+            <w:r/>
+            <w:r>
+              <w:rPr>
+                <w:rFonts w:ascii="Calibri" w:hAnsi="Calibri" w:eastAsia="Microsoft YaHei"/>
+                <w:b w:val="0"/>
+                <w:i w:val="0"/>
+                <w:color w:val="1A1A1A"/>
+                <w:sz w:val="14"/>
+              </w:rPr>
+              <w:t>8.91（23.4%）</w:t>
+            </w:r>
+          </w:p>
+        </w:tc>
+        <w:tc>
+          <w:tcPr>
+            <w:tcW w:type="dxa" w:w="1814"/>
+            <w:shd w:val="clear" w:color="auto" w:fill="F2F4F7"/>
+            <w:tcMar>
+              <w:top w:w="40" w:type="dxa"/>
+              <w:left w:w="90" w:type="dxa"/>
+              <w:bottom w:w="40" w:type="dxa"/>
+              <w:right w:w="90" w:type="dxa"/>
+            </w:tcMar>
+            <w:vAlign w:val="center"/>
+          </w:tcPr>
+          <w:p>
+            <w:pPr>
+              <w:keepNext/>
+              <w:spacing w:before="11" w:after="11" w:lineRule="auto" w:line="264"/>
+              <w:jc w:val="center"/>
+            </w:pPr>
+            <w:r/>
+            <w:r>
+              <w:rPr>
+                <w:rFonts w:ascii="Calibri" w:hAnsi="Calibri" w:eastAsia="Microsoft YaHei"/>
+                <w:b w:val="0"/>
+                <w:i w:val="0"/>
+                <w:color w:val="1A1A1A"/>
+                <w:sz w:val="14"/>
+              </w:rPr>
+              <w:t>15.88（16.0%）</w:t>
+            </w:r>
+          </w:p>
+        </w:tc>
+      </w:tr>
+      <w:tr>
+        <w:tc>
+          <w:tcPr>
+            <w:tcW w:type="dxa" w:w="2608"/>
+            <w:tcMar>
+              <w:top w:w="40" w:type="dxa"/>
+              <w:left w:w="90" w:type="dxa"/>
+              <w:bottom w:w="40" w:type="dxa"/>
+              <w:right w:w="90" w:type="dxa"/>
+            </w:tcMar>
+            <w:vAlign w:val="center"/>
+          </w:tcPr>
+          <w:p>
+            <w:pPr>
+              <w:keepNext/>
+              <w:spacing w:before="11" w:after="11" w:lineRule="auto" w:line="264"/>
+            </w:pPr>
+            <w:r/>
+            <w:r>
+              <w:rPr>
+                <w:rFonts w:ascii="Calibri" w:hAnsi="Calibri" w:eastAsia="Microsoft YaHei"/>
+                <w:b w:val="0"/>
+                <w:i w:val="0"/>
+                <w:color w:val="1A1A1A"/>
+                <w:sz w:val="14"/>
+              </w:rPr>
+              <w:t>净利润</w:t>
+            </w:r>
+          </w:p>
+        </w:tc>
+        <w:tc>
+          <w:tcPr>
+            <w:tcW w:type="dxa" w:w="1417"/>
+            <w:tcMar>
+              <w:top w:w="40" w:type="dxa"/>
+              <w:left w:w="90" w:type="dxa"/>
+              <w:bottom w:w="40" w:type="dxa"/>
+              <w:right w:w="90" w:type="dxa"/>
+            </w:tcMar>
+            <w:vAlign w:val="center"/>
+          </w:tcPr>
+          <w:p>
+            <w:pPr>
+              <w:keepNext/>
+              <w:spacing w:before="11" w:after="11" w:lineRule="auto" w:line="264"/>
+              <w:jc w:val="center"/>
+            </w:pPr>
+            <w:r/>
+            <w:r>
+              <w:rPr>
+                <w:rFonts w:ascii="Calibri" w:hAnsi="Calibri" w:eastAsia="Microsoft YaHei"/>
+                <w:b w:val="0"/>
+                <w:i w:val="0"/>
+                <w:color w:val="1A1A1A"/>
+                <w:sz w:val="14"/>
+              </w:rPr>
+              <w:t>(1.03)</w:t>
+            </w:r>
+          </w:p>
+        </w:tc>
+        <w:tc>
+          <w:tcPr>
+            <w:tcW w:type="dxa" w:w="1417"/>
+            <w:tcMar>
+              <w:top w:w="40" w:type="dxa"/>
+              <w:left w:w="90" w:type="dxa"/>
+              <w:bottom w:w="40" w:type="dxa"/>
+              <w:right w:w="90" w:type="dxa"/>
+            </w:tcMar>
+            <w:vAlign w:val="center"/>
+          </w:tcPr>
+          <w:p>
+            <w:pPr>
+              <w:keepNext/>
+              <w:spacing w:before="11" w:after="11" w:lineRule="auto" w:line="264"/>
+              <w:jc w:val="center"/>
+            </w:pPr>
+            <w:r/>
+            <w:r>
+              <w:rPr>
+                <w:rFonts w:ascii="Calibri" w:hAnsi="Calibri" w:eastAsia="Microsoft YaHei"/>
+                <w:b w:val="0"/>
+                <w:i w:val="0"/>
+                <w:color w:val="1A1A1A"/>
+                <w:sz w:val="14"/>
+              </w:rPr>
+              <w:t>1.90</w:t>
+            </w:r>
+          </w:p>
+        </w:tc>
+        <w:tc>
+          <w:tcPr>
+            <w:tcW w:type="dxa" w:w="1417"/>
+            <w:tcMar>
+              <w:top w:w="40" w:type="dxa"/>
+              <w:left w:w="90" w:type="dxa"/>
+              <w:bottom w:w="40" w:type="dxa"/>
+              <w:right w:w="90" w:type="dxa"/>
+            </w:tcMar>
+            <w:vAlign w:val="center"/>
+          </w:tcPr>
+          <w:p>
+            <w:pPr>
+              <w:keepNext/>
+              <w:spacing w:before="11" w:after="11" w:lineRule="auto" w:line="264"/>
+              <w:jc w:val="center"/>
+            </w:pPr>
+            <w:r/>
+            <w:r>
+              <w:rPr>
+                <w:rFonts w:ascii="Calibri" w:hAnsi="Calibri" w:eastAsia="Microsoft YaHei"/>
+                <w:b w:val="0"/>
+                <w:i w:val="0"/>
+                <w:color w:val="1A1A1A"/>
+                <w:sz w:val="14"/>
+              </w:rPr>
+              <w:t>3.39</w:t>
+            </w:r>
+          </w:p>
+        </w:tc>
+        <w:tc>
+          <w:tcPr>
+            <w:tcW w:type="dxa" w:w="1417"/>
+            <w:tcMar>
+              <w:top w:w="40" w:type="dxa"/>
+              <w:left w:w="90" w:type="dxa"/>
+              <w:bottom w:w="40" w:type="dxa"/>
+              <w:right w:w="90" w:type="dxa"/>
+            </w:tcMar>
+            <w:vAlign w:val="center"/>
+          </w:tcPr>
+          <w:p>
+            <w:pPr>
+              <w:keepNext/>
+              <w:spacing w:before="11" w:after="11" w:lineRule="auto" w:line="264"/>
+              <w:jc w:val="center"/>
+            </w:pPr>
+            <w:r/>
+            <w:r>
+              <w:rPr>
+                <w:rFonts w:ascii="Calibri" w:hAnsi="Calibri" w:eastAsia="Microsoft YaHei"/>
+                <w:b w:val="0"/>
+                <w:i w:val="0"/>
+                <w:color w:val="1A1A1A"/>
+                <w:sz w:val="14"/>
+              </w:rPr>
+              <w:t>6.02</w:t>
+            </w:r>
+          </w:p>
+        </w:tc>
+        <w:tc>
+          <w:tcPr>
+            <w:tcW w:type="dxa" w:w="1814"/>
+            <w:tcMar>
+              <w:top w:w="40" w:type="dxa"/>
+              <w:left w:w="90" w:type="dxa"/>
+              <w:bottom w:w="40" w:type="dxa"/>
+              <w:right w:w="90" w:type="dxa"/>
+            </w:tcMar>
+            <w:vAlign w:val="center"/>
+          </w:tcPr>
+          <w:p>
+            <w:pPr>
+              <w:keepNext/>
+              <w:spacing w:before="11" w:after="11" w:lineRule="auto" w:line="264"/>
+              <w:jc w:val="center"/>
+            </w:pPr>
+            <w:r/>
+            <w:r>
+              <w:rPr>
+                <w:rFonts w:ascii="Calibri" w:hAnsi="Calibri" w:eastAsia="Microsoft YaHei"/>
+                <w:b w:val="0"/>
+                <w:i w:val="0"/>
+                <w:color w:val="1A1A1A"/>
+                <w:sz w:val="14"/>
+              </w:rPr>
+              <w:t>10.28</w:t>
+            </w:r>
+          </w:p>
+        </w:tc>
+      </w:tr>
+      <w:tr>
+        <w:tc>
+          <w:tcPr>
+            <w:tcW w:type="dxa" w:w="2608"/>
+            <w:shd w:val="clear" w:color="auto" w:fill="F2F4F7"/>
+            <w:tcMar>
+              <w:top w:w="40" w:type="dxa"/>
+              <w:left w:w="90" w:type="dxa"/>
+              <w:bottom w:w="40" w:type="dxa"/>
+              <w:right w:w="90" w:type="dxa"/>
+            </w:tcMar>
+            <w:vAlign w:val="center"/>
+          </w:tcPr>
+          <w:p>
+            <w:pPr>
+              <w:spacing w:before="11" w:after="11" w:lineRule="auto" w:line="264"/>
+            </w:pPr>
+            <w:r/>
+            <w:r>
+              <w:rPr>
+                <w:rFonts w:ascii="Calibri" w:hAnsi="Calibri" w:eastAsia="Microsoft YaHei"/>
+                <w:b w:val="0"/>
+                <w:i w:val="0"/>
+                <w:color w:val="1A1A1A"/>
+                <w:sz w:val="14"/>
+              </w:rPr>
+              <w:t>经营现金流</w:t>
+            </w:r>
+          </w:p>
+        </w:tc>
+        <w:tc>
+          <w:tcPr>
+            <w:tcW w:type="dxa" w:w="1417"/>
+            <w:shd w:val="clear" w:color="auto" w:fill="F2F4F7"/>
+            <w:tcMar>
+              <w:top w:w="40" w:type="dxa"/>
+              <w:left w:w="90" w:type="dxa"/>
+              <w:bottom w:w="40" w:type="dxa"/>
+              <w:right w:w="90" w:type="dxa"/>
+            </w:tcMar>
+            <w:vAlign w:val="center"/>
+          </w:tcPr>
+          <w:p>
+            <w:pPr>
+              <w:spacing w:before="11" w:after="11" w:lineRule="auto" w:line="264"/>
+              <w:jc w:val="center"/>
+            </w:pPr>
+            <w:r/>
+            <w:r>
+              <w:rPr>
+                <w:rFonts w:ascii="Calibri" w:hAnsi="Calibri" w:eastAsia="Microsoft YaHei"/>
+                <w:b w:val="0"/>
+                <w:i w:val="0"/>
+                <w:color w:val="1A1A1A"/>
+                <w:sz w:val="14"/>
+              </w:rPr>
+              <w:t>启动投资</w:t>
+            </w:r>
+          </w:p>
+        </w:tc>
+        <w:tc>
+          <w:tcPr>
+            <w:tcW w:type="dxa" w:w="1417"/>
+            <w:shd w:val="clear" w:color="auto" w:fill="F2F4F7"/>
+            <w:tcMar>
+              <w:top w:w="40" w:type="dxa"/>
+              <w:left w:w="90" w:type="dxa"/>
+              <w:bottom w:w="40" w:type="dxa"/>
+              <w:right w:w="90" w:type="dxa"/>
+            </w:tcMar>
+            <w:vAlign w:val="center"/>
+          </w:tcPr>
+          <w:p>
+            <w:pPr>
+              <w:spacing w:before="11" w:after="11" w:lineRule="auto" w:line="264"/>
+              <w:jc w:val="center"/>
+            </w:pPr>
+            <w:r/>
+            <w:r>
+              <w:rPr>
+                <w:rFonts w:ascii="Calibri" w:hAnsi="Calibri" w:eastAsia="Microsoft YaHei"/>
+                <w:b w:val="0"/>
+                <w:i w:val="0"/>
+                <w:color w:val="1A1A1A"/>
+                <w:sz w:val="14"/>
+              </w:rPr>
+              <w:t>自给</w:t>
+            </w:r>
+          </w:p>
+        </w:tc>
+        <w:tc>
+          <w:tcPr>
+            <w:tcW w:type="dxa" w:w="1417"/>
+            <w:shd w:val="clear" w:color="auto" w:fill="F2F4F7"/>
+            <w:tcMar>
+              <w:top w:w="40" w:type="dxa"/>
+              <w:left w:w="90" w:type="dxa"/>
+              <w:bottom w:w="40" w:type="dxa"/>
+              <w:right w:w="90" w:type="dxa"/>
+            </w:tcMar>
+            <w:vAlign w:val="center"/>
+          </w:tcPr>
+          <w:p>
+            <w:pPr>
+              <w:spacing w:before="11" w:after="11" w:lineRule="auto" w:line="264"/>
+              <w:jc w:val="center"/>
+            </w:pPr>
+            <w:r/>
+            <w:r>
+              <w:rPr>
+                <w:rFonts w:ascii="Calibri" w:hAnsi="Calibri" w:eastAsia="Microsoft YaHei"/>
+                <w:b w:val="0"/>
+                <w:i w:val="0"/>
+                <w:color w:val="1A1A1A"/>
+                <w:sz w:val="14"/>
+              </w:rPr>
+              <w:t>自给并再投资</w:t>
+            </w:r>
+          </w:p>
+        </w:tc>
+        <w:tc>
+          <w:tcPr>
+            <w:tcW w:type="dxa" w:w="1417"/>
+            <w:shd w:val="clear" w:color="auto" w:fill="F2F4F7"/>
+            <w:tcMar>
+              <w:top w:w="40" w:type="dxa"/>
+              <w:left w:w="90" w:type="dxa"/>
+              <w:bottom w:w="40" w:type="dxa"/>
+              <w:right w:w="90" w:type="dxa"/>
+            </w:tcMar>
+            <w:vAlign w:val="center"/>
+          </w:tcPr>
+          <w:p>
+            <w:pPr>
+              <w:spacing w:before="11" w:after="11" w:lineRule="auto" w:line="264"/>
+              <w:jc w:val="center"/>
+            </w:pPr>
+            <w:r/>
+            <w:r>
+              <w:rPr>
+                <w:rFonts w:ascii="Calibri" w:hAnsi="Calibri" w:eastAsia="Microsoft YaHei"/>
+                <w:b w:val="0"/>
+                <w:i w:val="0"/>
+                <w:color w:val="1A1A1A"/>
+                <w:sz w:val="14"/>
+              </w:rPr>
+              <w:t>自给并再投资</w:t>
+            </w:r>
+          </w:p>
+        </w:tc>
+        <w:tc>
+          <w:tcPr>
+            <w:tcW w:type="dxa" w:w="1814"/>
+            <w:shd w:val="clear" w:color="auto" w:fill="F2F4F7"/>
+            <w:tcMar>
+              <w:top w:w="40" w:type="dxa"/>
+              <w:left w:w="90" w:type="dxa"/>
+              <w:bottom w:w="40" w:type="dxa"/>
+              <w:right w:w="90" w:type="dxa"/>
+            </w:tcMar>
+            <w:vAlign w:val="center"/>
+          </w:tcPr>
+          <w:p>
+            <w:pPr>
+              <w:spacing w:before="11" w:after="11" w:lineRule="auto" w:line="264"/>
+              <w:jc w:val="center"/>
+            </w:pPr>
+            <w:r/>
+            <w:r>
+              <w:rPr>
+                <w:rFonts w:ascii="Calibri" w:hAnsi="Calibri" w:eastAsia="Microsoft YaHei"/>
+                <w:b w:val="0"/>
+                <w:i w:val="0"/>
+                <w:color w:val="1A1A1A"/>
+                <w:sz w:val="14"/>
+              </w:rPr>
+              <w:t>第 4 个月起内生</w:t>
             </w:r>
           </w:p>
         </w:tc>
       </w:tr>
     </w:tbl>
+    <w:p>
+      <w:pPr>
+        <w:spacing w:before="0" w:after="0" w:line="80" w:lineRule="exact"/>
+      </w:pPr>
+      <w:r>
+        <w:rPr>
+          <w:rFonts w:ascii="Calibri" w:hAnsi="Calibri" w:eastAsia="Microsoft YaHei"/>
+          <w:b w:val="0"/>
+          <w:i w:val="0"/>
+          <w:color w:val="1A1A1A"/>
+          <w:sz w:val="2"/>
+        </w:rPr>
+      </w:r>
+    </w:p>
     <w:p>
       <w:pPr>
         <w:spacing w:before="0" w:after="0"/>

</xml_diff>